<commit_message>
Add unit tests for elearning and weekly plan synchronization features
- Implement tests for course synchronization in `test_elearning_sync.py` to verify full snapshot and delta updates.
- Add tests for weekly plan synchronization in `test_weekly_plan_sync.py` to ensure correct handling of write dates and class scopes.
- Introduce caching logic in `cache_scope.dart` to manage token-based cache scopes.
- Create comprehensive tests for attendance and calendar synchronization, ensuring proper delta handling and offline fallback mechanisms.
- Enhance the test suite for various features, including assignment, CBT, tagihan, and E-Rapor, to validate data integrity and synchronization logic.
</commit_message>
<xml_diff>
--- a/fast-api-middleware/app/features/e_rapor/templates/rapor_template.docx
+++ b/fast-api-middleware/app/features/e_rapor/templates/rapor_template.docx
@@ -164,7 +164,7 @@
           </mc:Choice>
           <mc:Fallback>
             <w:pict>
-              <v:group w14:anchorId="359E4002" id="Group 1" o:spid="_x0000_s1026" style="width:530.6pt;height:67.2pt;mso-position-horizontal-relative:char;mso-position-vertical-relative:line" coordsize="67386,8536" o:gfxdata="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">
+              <v:group w14:anchorId="3E15BD45" id="Group 1" o:spid="_x0000_s1026" style="width:530.6pt;height:67.2pt;mso-position-horizontal-relative:char;mso-position-vertical-relative:line" coordsize="67386,8536" o:gfxdata="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">
                 <v:shape id="Graphic 2" o:spid="_x0000_s1027" style="position:absolute;top:8371;width:67386;height:165;visibility:visible;mso-wrap-style:square;v-text-anchor:top" coordsize="6738620,16510" o:gfxdata="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" path="m6738111,16255l,16255,,,6738111,r,16255xe" fillcolor="black" stroked="f">
                   <v:path arrowok="t"/>
                 </v:shape>
@@ -1489,12 +1489,13 @@
         <w:tc>
           <w:tcPr>
             <w:tcW w:w="742" w:type="dxa"/>
+            <w:vAlign w:val="center"/>
           </w:tcPr>
           <w:p>
             <w:pPr>
               <w:pStyle w:val="TableParagraph"/>
-              <w:spacing w:before="201"/>
-              <w:ind w:left="235"/>
+              <w:spacing w:before="0"/>
+              <w:jc w:val="center"/>
               <w:rPr>
                 <w:bCs/>
                 <w:spacing w:val="-5"/>
@@ -1520,7 +1521,7 @@
           <w:p>
             <w:pPr>
               <w:pStyle w:val="TableParagraph"/>
-              <w:spacing w:before="98" w:line="249" w:lineRule="auto"/>
+              <w:spacing w:before="0" w:line="249" w:lineRule="auto"/>
               <w:ind w:right="286"/>
               <w:rPr>
                 <w:bCs/>
@@ -1547,7 +1548,7 @@
           <w:p>
             <w:pPr>
               <w:pStyle w:val="TableParagraph"/>
-              <w:spacing w:before="201"/>
+              <w:spacing w:before="0"/>
               <w:ind w:left="204"/>
               <w:rPr>
                 <w:bCs/>
@@ -1572,7 +1573,7 @@
           <w:p>
             <w:pPr>
               <w:pStyle w:val="TableParagraph"/>
-              <w:spacing w:before="201"/>
+              <w:spacing w:before="0"/>
               <w:rPr>
                 <w:bCs/>
                 <w:w w:val="120"/>
@@ -1596,7 +1597,7 @@
           <w:p>
             <w:pPr>
               <w:pStyle w:val="TableParagraph"/>
-              <w:spacing w:before="201"/>
+              <w:spacing w:before="0"/>
               <w:rPr>
                 <w:b/>
                 <w:w w:val="120"/>
@@ -1606,7 +1607,7 @@
             <w:r>
               <w:rPr>
                 <w:rStyle w:val="HTMLCode"/>
-                <w:rFonts w:eastAsia="Trebuchet MS"/>
+                <w:rFonts w:ascii="Trebuchet MS" w:eastAsia="Trebuchet MS" w:hAnsi="Trebuchet MS"/>
               </w:rPr>
               <w:t>{{ sub.catatan }}</w:t>
             </w:r>
@@ -1616,7 +1617,7 @@
             <w:r>
               <w:rPr>
                 <w:rStyle w:val="HTMLCode"/>
-                <w:rFonts w:eastAsia="Trebuchet MS"/>
+                <w:rFonts w:ascii="Trebuchet MS" w:eastAsia="Trebuchet MS" w:hAnsi="Trebuchet MS"/>
               </w:rPr>
               <w:t>{% endfor %}</w:t>
             </w:r>
@@ -1895,11 +1896,13 @@
               <w:bottom w:val="single" w:sz="6" w:space="0" w:color="000000"/>
               <w:right w:val="single" w:sz="6" w:space="0" w:color="000000"/>
             </w:tcBorders>
+            <w:vAlign w:val="center"/>
           </w:tcPr>
           <w:p>
             <w:pPr>
               <w:pStyle w:val="TableParagraph"/>
-              <w:spacing w:before="201"/>
+              <w:spacing w:before="0"/>
+              <w:jc w:val="center"/>
               <w:rPr>
                 <w:bCs/>
                 <w:spacing w:val="-5"/>
@@ -1914,79 +1917,7 @@
                 <w:w w:val="120"/>
                 <w:sz w:val="18"/>
               </w:rPr>
-              <w:t xml:space="preserve">{% for </w:t>
-            </w:r>
-            <w:r>
-              <w:rPr>
-                <w:bCs/>
-                <w:spacing w:val="-5"/>
-                <w:w w:val="120"/>
-                <w:sz w:val="18"/>
-              </w:rPr>
-              <w:t>mulok</w:t>
-            </w:r>
-            <w:r>
-              <w:rPr>
-                <w:bCs/>
-                <w:spacing w:val="-5"/>
-                <w:w w:val="120"/>
-                <w:sz w:val="18"/>
-              </w:rPr>
-              <w:t xml:space="preserve"> in </w:t>
-            </w:r>
-            <w:r>
-              <w:rPr>
-                <w:bCs/>
-                <w:spacing w:val="-5"/>
-                <w:w w:val="120"/>
-                <w:sz w:val="18"/>
-              </w:rPr>
-              <w:t>muatan_lokal</w:t>
-            </w:r>
-            <w:r>
-              <w:rPr>
-                <w:bCs/>
-                <w:spacing w:val="-5"/>
-                <w:w w:val="120"/>
-                <w:sz w:val="18"/>
-              </w:rPr>
-              <w:t xml:space="preserve"> %}</w:t>
-            </w:r>
-            <w:r>
-              <w:rPr>
-                <w:bCs/>
-                <w:spacing w:val="-5"/>
-                <w:w w:val="120"/>
-                <w:sz w:val="18"/>
-              </w:rPr>
-              <w:t xml:space="preserve"> </w:t>
-            </w:r>
-            <w:r>
-              <w:rPr>
-                <w:bCs/>
-                <w:spacing w:val="-5"/>
-                <w:w w:val="120"/>
-                <w:sz w:val="18"/>
-              </w:rPr>
-              <w:t>{{</w:t>
-            </w:r>
-            <w:r>
-              <w:rPr>
-                <w:bCs/>
-                <w:spacing w:val="-5"/>
-                <w:w w:val="120"/>
-                <w:sz w:val="18"/>
-              </w:rPr>
-              <w:t xml:space="preserve"> mulok.no </w:t>
-            </w:r>
-            <w:r>
-              <w:rPr>
-                <w:bCs/>
-                <w:spacing w:val="-5"/>
-                <w:w w:val="120"/>
-                <w:sz w:val="18"/>
-              </w:rPr>
-              <w:t>}}</w:t>
+              <w:t>{% for m in muatan_lokal %} {{ m.no }}</w:t>
             </w:r>
           </w:p>
         </w:tc>
@@ -2003,7 +1934,7 @@
           <w:p>
             <w:pPr>
               <w:pStyle w:val="TableParagraph"/>
-              <w:spacing w:before="98" w:line="249" w:lineRule="auto"/>
+              <w:spacing w:before="0" w:line="249" w:lineRule="auto"/>
               <w:ind w:right="286"/>
               <w:rPr>
                 <w:bCs/>
@@ -2028,7 +1959,7 @@
                 <w:w w:val="120"/>
                 <w:sz w:val="18"/>
               </w:rPr>
-              <w:t>mulok.subject</w:t>
+              <w:t>m.subject</w:t>
             </w:r>
             <w:r>
               <w:rPr>
@@ -2054,7 +1985,7 @@
           <w:p>
             <w:pPr>
               <w:pStyle w:val="TableParagraph"/>
-              <w:spacing w:before="201"/>
+              <w:spacing w:before="0"/>
               <w:rPr>
                 <w:bCs/>
                 <w:w w:val="120"/>
@@ -2067,23 +1998,7 @@
                 <w:w w:val="120"/>
                 <w:sz w:val="18"/>
               </w:rPr>
-              <w:t xml:space="preserve">{{ </w:t>
-            </w:r>
-            <w:r>
-              <w:rPr>
-                <w:bCs/>
-                <w:w w:val="120"/>
-                <w:sz w:val="18"/>
-              </w:rPr>
-              <w:t>mulok</w:t>
-            </w:r>
-            <w:r>
-              <w:rPr>
-                <w:bCs/>
-                <w:w w:val="120"/>
-                <w:sz w:val="18"/>
-              </w:rPr>
-              <w:t>.nilai_akhir }}</w:t>
+              <w:t>{{ m.nilai_akhir }}</w:t>
             </w:r>
           </w:p>
         </w:tc>
@@ -2100,7 +2015,7 @@
           <w:p>
             <w:pPr>
               <w:pStyle w:val="TableParagraph"/>
-              <w:spacing w:before="201"/>
+              <w:spacing w:before="0"/>
               <w:rPr>
                 <w:bCs/>
                 <w:w w:val="120"/>
@@ -2113,23 +2028,7 @@
                 <w:w w:val="120"/>
                 <w:sz w:val="18"/>
               </w:rPr>
-              <w:t xml:space="preserve">{{ </w:t>
-            </w:r>
-            <w:r>
-              <w:rPr>
-                <w:bCs/>
-                <w:w w:val="120"/>
-                <w:sz w:val="18"/>
-              </w:rPr>
-              <w:t>mulok</w:t>
-            </w:r>
-            <w:r>
-              <w:rPr>
-                <w:bCs/>
-                <w:w w:val="120"/>
-                <w:sz w:val="18"/>
-              </w:rPr>
-              <w:t>.predikat }}</w:t>
+              <w:t>{{ m.predikat }}</w:t>
             </w:r>
           </w:p>
         </w:tc>
@@ -2146,7 +2045,7 @@
           <w:p>
             <w:pPr>
               <w:pStyle w:val="TableParagraph"/>
-              <w:spacing w:before="201"/>
+              <w:spacing w:before="0"/>
               <w:rPr>
                 <w:bCs/>
                 <w:w w:val="120"/>
@@ -2162,29 +2061,7 @@
                 <w:sz w:val="18"/>
                 <w:szCs w:val="22"/>
               </w:rPr>
-              <w:t xml:space="preserve">{{ </w:t>
-            </w:r>
-            <w:r>
-              <w:rPr>
-                <w:rStyle w:val="HTMLCode"/>
-                <w:rFonts w:ascii="Trebuchet MS" w:eastAsia="Trebuchet MS" w:hAnsi="Trebuchet MS" w:cs="Trebuchet MS"/>
-                <w:bCs/>
-                <w:w w:val="120"/>
-                <w:sz w:val="18"/>
-                <w:szCs w:val="22"/>
-              </w:rPr>
-              <w:t>mulok</w:t>
-            </w:r>
-            <w:r>
-              <w:rPr>
-                <w:rStyle w:val="HTMLCode"/>
-                <w:rFonts w:ascii="Trebuchet MS" w:eastAsia="Trebuchet MS" w:hAnsi="Trebuchet MS" w:cs="Trebuchet MS"/>
-                <w:bCs/>
-                <w:w w:val="120"/>
-                <w:sz w:val="18"/>
-                <w:szCs w:val="22"/>
-              </w:rPr>
-              <w:t>.catatan }}{% endfor %}</w:t>
+              <w:t>{{ m.catatan }} {% endfor %}</w:t>
             </w:r>
           </w:p>
         </w:tc>
@@ -2523,7 +2400,7 @@
           </mc:Choice>
           <mc:Fallback>
             <w:pict>
-              <v:shape w14:anchorId="67C0D496" id="Graphic 7" o:spid="_x0000_s1026" style="position:absolute;margin-left:80.65pt;margin-top:22.75pt;width:80.65pt;height:.1pt;z-index:-15727616;visibility:visible;mso-wrap-style:square;mso-wrap-distance-left:0;mso-wrap-distance-top:0;mso-wrap-distance-right:0;mso-wrap-distance-bottom:0;mso-position-horizontal:absolute;mso-position-horizontal-relative:page;mso-position-vertical:absolute;mso-position-vertical-relative:text;v-text-anchor:top" coordsize="1024255,1270" o:gfxdata="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" path="m,l1024128,e" filled="f" strokeweight=".22069mm">
+              <v:shape w14:anchorId="5C5DB690" id="Graphic 7" o:spid="_x0000_s1026" style="position:absolute;margin-left:80.65pt;margin-top:22.75pt;width:80.65pt;height:.1pt;z-index:-15727616;visibility:visible;mso-wrap-style:square;mso-wrap-distance-left:0;mso-wrap-distance-top:0;mso-wrap-distance-right:0;mso-wrap-distance-bottom:0;mso-position-horizontal:absolute;mso-position-horizontal-relative:page;mso-position-vertical:absolute;mso-position-vertical-relative:text;v-text-anchor:top" coordsize="1024255,1270" o:gfxdata="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" path="m,l1024128,e" filled="f" strokeweight=".22069mm">
                 <v:path arrowok="t"/>
                 <w10:wrap type="topAndBottom" anchorx="page"/>
               </v:shape>
@@ -2603,7 +2480,7 @@
           </mc:Choice>
           <mc:Fallback>
             <w:pict>
-              <v:shape w14:anchorId="74E5B66C" id="Graphic 8" o:spid="_x0000_s1026" style="position:absolute;margin-left:256.95pt;margin-top:22.75pt;width:80.65pt;height:.1pt;z-index:-15727104;visibility:visible;mso-wrap-style:square;mso-wrap-distance-left:0;mso-wrap-distance-top:0;mso-wrap-distance-right:0;mso-wrap-distance-bottom:0;mso-position-horizontal:absolute;mso-position-horizontal-relative:page;mso-position-vertical:absolute;mso-position-vertical-relative:text;v-text-anchor:top" coordsize="1024255,1270" o:gfxdata="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" path="m,l1024128,e" filled="f" strokeweight=".22069mm">
+              <v:shape w14:anchorId="6F38C176" id="Graphic 8" o:spid="_x0000_s1026" style="position:absolute;margin-left:256.95pt;margin-top:22.75pt;width:80.65pt;height:.1pt;z-index:-15727104;visibility:visible;mso-wrap-style:square;mso-wrap-distance-left:0;mso-wrap-distance-top:0;mso-wrap-distance-right:0;mso-wrap-distance-bottom:0;mso-position-horizontal:absolute;mso-position-horizontal-relative:page;mso-position-vertical:absolute;mso-position-vertical-relative:text;v-text-anchor:top" coordsize="1024255,1270" o:gfxdata="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" path="m,l1024128,e" filled="f" strokeweight=".22069mm">
                 <v:path arrowok="t"/>
                 <w10:wrap type="topAndBottom" anchorx="page"/>
               </v:shape>
@@ -2683,7 +2560,7 @@
           </mc:Choice>
           <mc:Fallback>
             <w:pict>
-              <v:shape w14:anchorId="23406E3F" id="Graphic 9" o:spid="_x0000_s1026" style="position:absolute;margin-left:433.6pt;margin-top:22.75pt;width:80.65pt;height:.1pt;z-index:-15726592;visibility:visible;mso-wrap-style:square;mso-wrap-distance-left:0;mso-wrap-distance-top:0;mso-wrap-distance-right:0;mso-wrap-distance-bottom:0;mso-position-horizontal:absolute;mso-position-horizontal-relative:page;mso-position-vertical:absolute;mso-position-vertical-relative:text;v-text-anchor:top" coordsize="1024255,1270" o:gfxdata="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" path="m,l1024128,e" filled="f" strokeweight=".22069mm">
+              <v:shape w14:anchorId="6C2356FA" id="Graphic 9" o:spid="_x0000_s1026" style="position:absolute;margin-left:433.6pt;margin-top:22.75pt;width:80.65pt;height:.1pt;z-index:-15726592;visibility:visible;mso-wrap-style:square;mso-wrap-distance-left:0;mso-wrap-distance-top:0;mso-wrap-distance-right:0;mso-wrap-distance-bottom:0;mso-position-horizontal:absolute;mso-position-horizontal-relative:page;mso-position-vertical:absolute;mso-position-vertical-relative:text;v-text-anchor:top" coordsize="1024255,1270" o:gfxdata="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" path="m,l1024128,e" filled="f" strokeweight=".22069mm">
                 <v:path arrowok="t"/>
                 <w10:wrap type="topAndBottom" anchorx="page"/>
               </v:shape>

</xml_diff>

<commit_message>
feat: implement user-friendly error handling across the application
- Added a new service `user_friendly_error.dart` to standardize error messages.
- Updated various view models and views to utilize the new error handling service, providing more user-friendly messages for different error scenarios.
- Enhanced error handling in attendance, e-learning, and curriculum features to improve user experience.
- Introduced tests for the new error handling service to ensure reliability and correctness.
</commit_message>
<xml_diff>
--- a/fast-api-middleware/app/features/e_rapor/templates/rapor_template.docx
+++ b/fast-api-middleware/app/features/e_rapor/templates/rapor_template.docx
@@ -164,7 +164,7 @@
           </mc:Choice>
           <mc:Fallback>
             <w:pict>
-              <v:group w14:anchorId="3E15BD45" id="Group 1" o:spid="_x0000_s1026" style="width:530.6pt;height:67.2pt;mso-position-horizontal-relative:char;mso-position-vertical-relative:line" coordsize="67386,8536" o:gfxdata="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">
+              <v:group w14:anchorId="2FE3C736" id="Group 1" o:spid="_x0000_s1026" style="width:530.6pt;height:67.2pt;mso-position-horizontal-relative:char;mso-position-vertical-relative:line" coordsize="67386,8536" o:gfxdata="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">
                 <v:shape id="Graphic 2" o:spid="_x0000_s1027" style="position:absolute;top:8371;width:67386;height:165;visibility:visible;mso-wrap-style:square;v-text-anchor:top" coordsize="6738620,16510" o:gfxdata="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" path="m6738111,16255l,16255,,,6738111,r,16255xe" fillcolor="black" stroked="f">
                   <v:path arrowok="t"/>
                 </v:shape>
@@ -1492,25 +1492,8 @@
             <w:vAlign w:val="center"/>
           </w:tcPr>
           <w:p>
-            <w:pPr>
-              <w:pStyle w:val="TableParagraph"/>
-              <w:spacing w:before="0"/>
-              <w:jc w:val="center"/>
-              <w:rPr>
-                <w:bCs/>
-                <w:spacing w:val="-5"/>
-                <w:w w:val="120"/>
-                <w:sz w:val="18"/>
-              </w:rPr>
-            </w:pPr>
-            <w:r>
-              <w:rPr>
-                <w:bCs/>
-                <w:spacing w:val="-5"/>
-                <w:w w:val="120"/>
-                <w:sz w:val="18"/>
-              </w:rPr>
-              <w:t>{% for sub in subjects %} {{ loop.index }}</w:t>
+            <w:r>
+              <w:t>{%tr for sub in subjects %}</w:t>
             </w:r>
           </w:p>
         </w:tc>
@@ -1519,24 +1502,55 @@
             <w:tcW w:w="1574" w:type="dxa"/>
           </w:tcPr>
           <w:p>
-            <w:pPr>
-              <w:pStyle w:val="TableParagraph"/>
-              <w:spacing w:before="0" w:line="249" w:lineRule="auto"/>
-              <w:ind w:right="286"/>
-              <w:rPr>
-                <w:bCs/>
-                <w:spacing w:val="-4"/>
-                <w:w w:val="120"/>
-                <w:sz w:val="18"/>
-              </w:rPr>
-            </w:pPr>
-            <w:r>
-              <w:rPr>
-                <w:bCs/>
-                <w:spacing w:val="-4"/>
-                <w:w w:val="120"/>
-                <w:sz w:val="18"/>
-              </w:rPr>
+            <w:r/>
+          </w:p>
+        </w:tc>
+        <w:tc>
+          <w:tcPr>
+            <w:tcW w:w="1472" w:type="dxa"/>
+          </w:tcPr>
+          <w:p>
+            <w:r/>
+          </w:p>
+        </w:tc>
+        <w:tc>
+          <w:tcPr>
+            <w:tcW w:w="3405" w:type="dxa"/>
+          </w:tcPr>
+          <w:p>
+            <w:r/>
+          </w:p>
+        </w:tc>
+        <w:tc>
+          <w:tcPr>
+            <w:tcW w:w="3405" w:type="dxa"/>
+          </w:tcPr>
+          <w:p>
+            <w:r/>
+          </w:p>
+        </w:tc>
+      </w:tr>
+      <w:tr>
+        <w:trPr>
+          <w:trHeight w:val="637"/>
+        </w:trPr>
+        <w:tc>
+          <w:tcPr>
+            <w:tcW w:w="742" w:type="dxa"/>
+            <w:vAlign w:val="center"/>
+          </w:tcPr>
+          <w:p>
+            <w:r>
+              <w:t>{{ sub.no }}</w:t>
+            </w:r>
+          </w:p>
+        </w:tc>
+        <w:tc>
+          <w:tcPr>
+            <w:tcW w:w="1574" w:type="dxa"/>
+          </w:tcPr>
+          <w:p>
+            <w:r>
               <w:t>{{ sub.subject_name }}</w:t>
             </w:r>
           </w:p>
@@ -1546,22 +1560,7 @@
             <w:tcW w:w="1472" w:type="dxa"/>
           </w:tcPr>
           <w:p>
-            <w:pPr>
-              <w:pStyle w:val="TableParagraph"/>
-              <w:spacing w:before="0"/>
-              <w:ind w:left="204"/>
-              <w:rPr>
-                <w:bCs/>
-                <w:w w:val="120"/>
-                <w:sz w:val="18"/>
-              </w:rPr>
-            </w:pPr>
-            <w:r>
-              <w:rPr>
-                <w:bCs/>
-                <w:w w:val="120"/>
-                <w:sz w:val="18"/>
-              </w:rPr>
+            <w:r>
               <w:t>{{ sub.nilai_akhir }}</w:t>
             </w:r>
           </w:p>
@@ -1571,21 +1570,7 @@
             <w:tcW w:w="3405" w:type="dxa"/>
           </w:tcPr>
           <w:p>
-            <w:pPr>
-              <w:pStyle w:val="TableParagraph"/>
-              <w:spacing w:before="0"/>
-              <w:rPr>
-                <w:bCs/>
-                <w:w w:val="120"/>
-                <w:sz w:val="18"/>
-              </w:rPr>
-            </w:pPr>
-            <w:r>
-              <w:rPr>
-                <w:bCs/>
-                <w:w w:val="120"/>
-                <w:sz w:val="18"/>
-              </w:rPr>
+            <w:r>
               <w:t>{{ sub.predikat }}</w:t>
             </w:r>
           </w:p>
@@ -1595,32 +1580,57 @@
             <w:tcW w:w="3405" w:type="dxa"/>
           </w:tcPr>
           <w:p>
-            <w:pPr>
-              <w:pStyle w:val="TableParagraph"/>
-              <w:spacing w:before="0"/>
-              <w:rPr>
-                <w:b/>
-                <w:w w:val="120"/>
-                <w:sz w:val="18"/>
-              </w:rPr>
-            </w:pPr>
-            <w:r>
-              <w:rPr>
-                <w:rStyle w:val="HTMLCode"/>
-                <w:rFonts w:ascii="Trebuchet MS" w:eastAsia="Trebuchet MS" w:hAnsi="Trebuchet MS"/>
-              </w:rPr>
+            <w:r>
               <w:t>{{ sub.catatan }}</w:t>
             </w:r>
-            <w:r>
-              <w:t xml:space="preserve"> </w:t>
-            </w:r>
-            <w:r>
-              <w:rPr>
-                <w:rStyle w:val="HTMLCode"/>
-                <w:rFonts w:ascii="Trebuchet MS" w:eastAsia="Trebuchet MS" w:hAnsi="Trebuchet MS"/>
-              </w:rPr>
-              <w:t>{% endfor %}</w:t>
-            </w:r>
+          </w:p>
+        </w:tc>
+      </w:tr>
+      <w:tr>
+        <w:trPr>
+          <w:trHeight w:val="637"/>
+        </w:trPr>
+        <w:tc>
+          <w:tcPr>
+            <w:tcW w:w="742" w:type="dxa"/>
+            <w:vAlign w:val="center"/>
+          </w:tcPr>
+          <w:p>
+            <w:r>
+              <w:t>{%tr endfor %}</w:t>
+            </w:r>
+          </w:p>
+        </w:tc>
+        <w:tc>
+          <w:tcPr>
+            <w:tcW w:w="1574" w:type="dxa"/>
+          </w:tcPr>
+          <w:p>
+            <w:r/>
+          </w:p>
+        </w:tc>
+        <w:tc>
+          <w:tcPr>
+            <w:tcW w:w="1472" w:type="dxa"/>
+          </w:tcPr>
+          <w:p>
+            <w:r/>
+          </w:p>
+        </w:tc>
+        <w:tc>
+          <w:tcPr>
+            <w:tcW w:w="3405" w:type="dxa"/>
+          </w:tcPr>
+          <w:p>
+            <w:r/>
+          </w:p>
+        </w:tc>
+        <w:tc>
+          <w:tcPr>
+            <w:tcW w:w="3405" w:type="dxa"/>
+          </w:tcPr>
+          <w:p>
+            <w:r/>
           </w:p>
         </w:tc>
       </w:tr>
@@ -1899,25 +1909,8 @@
             <w:vAlign w:val="center"/>
           </w:tcPr>
           <w:p>
-            <w:pPr>
-              <w:pStyle w:val="TableParagraph"/>
-              <w:spacing w:before="0"/>
-              <w:jc w:val="center"/>
-              <w:rPr>
-                <w:bCs/>
-                <w:spacing w:val="-5"/>
-                <w:w w:val="120"/>
-                <w:sz w:val="18"/>
-              </w:rPr>
-            </w:pPr>
-            <w:r>
-              <w:rPr>
-                <w:bCs/>
-                <w:spacing w:val="-5"/>
-                <w:w w:val="120"/>
-                <w:sz w:val="18"/>
-              </w:rPr>
-              <w:t>{% for m in muatan_lokal %} {{ m.no }}</w:t>
+            <w:r>
+              <w:t>{%tr for m in muatan_lokal %}</w:t>
             </w:r>
           </w:p>
         </w:tc>
@@ -1932,44 +1925,7 @@
             </w:tcBorders>
           </w:tcPr>
           <w:p>
-            <w:pPr>
-              <w:pStyle w:val="TableParagraph"/>
-              <w:spacing w:before="0" w:line="249" w:lineRule="auto"/>
-              <w:ind w:right="286"/>
-              <w:rPr>
-                <w:bCs/>
-                <w:spacing w:val="-4"/>
-                <w:w w:val="120"/>
-                <w:sz w:val="18"/>
-              </w:rPr>
-            </w:pPr>
-            <w:r>
-              <w:rPr>
-                <w:bCs/>
-                <w:spacing w:val="-4"/>
-                <w:w w:val="120"/>
-                <w:sz w:val="18"/>
-              </w:rPr>
-              <w:t xml:space="preserve">{{ </w:t>
-            </w:r>
-            <w:r>
-              <w:rPr>
-                <w:bCs/>
-                <w:spacing w:val="-4"/>
-                <w:w w:val="120"/>
-                <w:sz w:val="18"/>
-              </w:rPr>
-              <w:t>m.subject</w:t>
-            </w:r>
-            <w:r>
-              <w:rPr>
-                <w:bCs/>
-                <w:spacing w:val="-4"/>
-                <w:w w:val="120"/>
-                <w:sz w:val="18"/>
-              </w:rPr>
-              <w:t>_name }}</w:t>
-            </w:r>
+            <w:r/>
           </w:p>
         </w:tc>
         <w:tc>
@@ -1983,23 +1939,7 @@
             </w:tcBorders>
           </w:tcPr>
           <w:p>
-            <w:pPr>
-              <w:pStyle w:val="TableParagraph"/>
-              <w:spacing w:before="0"/>
-              <w:rPr>
-                <w:bCs/>
-                <w:w w:val="120"/>
-                <w:sz w:val="18"/>
-              </w:rPr>
-            </w:pPr>
-            <w:r>
-              <w:rPr>
-                <w:bCs/>
-                <w:w w:val="120"/>
-                <w:sz w:val="18"/>
-              </w:rPr>
-              <w:t>{{ m.nilai_akhir }}</w:t>
-            </w:r>
+            <w:r/>
           </w:p>
         </w:tc>
         <w:tc>
@@ -2013,23 +1953,7 @@
             </w:tcBorders>
           </w:tcPr>
           <w:p>
-            <w:pPr>
-              <w:pStyle w:val="TableParagraph"/>
-              <w:spacing w:before="0"/>
-              <w:rPr>
-                <w:bCs/>
-                <w:w w:val="120"/>
-                <w:sz w:val="18"/>
-              </w:rPr>
-            </w:pPr>
-            <w:r>
-              <w:rPr>
-                <w:bCs/>
-                <w:w w:val="120"/>
-                <w:sz w:val="18"/>
-              </w:rPr>
-              <w:t>{{ m.predikat }}</w:t>
-            </w:r>
+            <w:r/>
           </w:p>
         </w:tc>
         <w:tc>
@@ -2043,26 +1967,171 @@
             </w:tcBorders>
           </w:tcPr>
           <w:p>
-            <w:pPr>
-              <w:pStyle w:val="TableParagraph"/>
-              <w:spacing w:before="0"/>
-              <w:rPr>
-                <w:bCs/>
-                <w:w w:val="120"/>
-                <w:sz w:val="18"/>
-              </w:rPr>
-            </w:pPr>
-            <w:r>
-              <w:rPr>
-                <w:rStyle w:val="HTMLCode"/>
-                <w:rFonts w:ascii="Trebuchet MS" w:eastAsia="Trebuchet MS" w:hAnsi="Trebuchet MS" w:cs="Trebuchet MS"/>
-                <w:bCs/>
-                <w:w w:val="120"/>
-                <w:sz w:val="18"/>
-                <w:szCs w:val="22"/>
-              </w:rPr>
-              <w:t>{{ m.catatan }} {% endfor %}</w:t>
-            </w:r>
+            <w:r/>
+          </w:p>
+        </w:tc>
+      </w:tr>
+      <w:tr>
+        <w:trPr>
+          <w:trHeight w:val="637"/>
+        </w:trPr>
+        <w:tc>
+          <w:tcPr>
+            <w:tcW w:w="742" w:type="dxa"/>
+            <w:tcBorders>
+              <w:top w:val="single" w:sz="6" w:space="0" w:color="000000"/>
+              <w:left w:val="single" w:sz="6" w:space="0" w:color="000000"/>
+              <w:bottom w:val="single" w:sz="6" w:space="0" w:color="000000"/>
+              <w:right w:val="single" w:sz="6" w:space="0" w:color="000000"/>
+            </w:tcBorders>
+            <w:vAlign w:val="center"/>
+          </w:tcPr>
+          <w:p>
+            <w:r>
+              <w:t>{{ m.no }}</w:t>
+            </w:r>
+          </w:p>
+        </w:tc>
+        <w:tc>
+          <w:tcPr>
+            <w:tcW w:w="1574" w:type="dxa"/>
+            <w:tcBorders>
+              <w:top w:val="single" w:sz="6" w:space="0" w:color="000000"/>
+              <w:left w:val="single" w:sz="6" w:space="0" w:color="000000"/>
+              <w:bottom w:val="single" w:sz="6" w:space="0" w:color="000000"/>
+              <w:right w:val="single" w:sz="6" w:space="0" w:color="000000"/>
+            </w:tcBorders>
+          </w:tcPr>
+          <w:p>
+            <w:r>
+              <w:t>{{ m.subject_name }}</w:t>
+            </w:r>
+          </w:p>
+        </w:tc>
+        <w:tc>
+          <w:tcPr>
+            <w:tcW w:w="1472" w:type="dxa"/>
+            <w:tcBorders>
+              <w:top w:val="single" w:sz="6" w:space="0" w:color="000000"/>
+              <w:left w:val="single" w:sz="6" w:space="0" w:color="000000"/>
+              <w:bottom w:val="single" w:sz="6" w:space="0" w:color="000000"/>
+              <w:right w:val="single" w:sz="6" w:space="0" w:color="000000"/>
+            </w:tcBorders>
+          </w:tcPr>
+          <w:p>
+            <w:r>
+              <w:t>{{ m.nilai_akhir }}</w:t>
+            </w:r>
+          </w:p>
+        </w:tc>
+        <w:tc>
+          <w:tcPr>
+            <w:tcW w:w="3405" w:type="dxa"/>
+            <w:tcBorders>
+              <w:top w:val="single" w:sz="6" w:space="0" w:color="000000"/>
+              <w:left w:val="single" w:sz="6" w:space="0" w:color="000000"/>
+              <w:bottom w:val="single" w:sz="6" w:space="0" w:color="000000"/>
+              <w:right w:val="single" w:sz="6" w:space="0" w:color="000000"/>
+            </w:tcBorders>
+          </w:tcPr>
+          <w:p>
+            <w:r>
+              <w:t>{{ m.predikat }}</w:t>
+            </w:r>
+          </w:p>
+        </w:tc>
+        <w:tc>
+          <w:tcPr>
+            <w:tcW w:w="3405" w:type="dxa"/>
+            <w:tcBorders>
+              <w:top w:val="single" w:sz="6" w:space="0" w:color="000000"/>
+              <w:left w:val="single" w:sz="6" w:space="0" w:color="000000"/>
+              <w:bottom w:val="single" w:sz="6" w:space="0" w:color="000000"/>
+              <w:right w:val="single" w:sz="6" w:space="0" w:color="000000"/>
+            </w:tcBorders>
+          </w:tcPr>
+          <w:p>
+            <w:r>
+              <w:t>{{ m.catatan }}</w:t>
+            </w:r>
+          </w:p>
+        </w:tc>
+      </w:tr>
+      <w:tr>
+        <w:trPr>
+          <w:trHeight w:val="637"/>
+        </w:trPr>
+        <w:tc>
+          <w:tcPr>
+            <w:tcW w:w="742" w:type="dxa"/>
+            <w:tcBorders>
+              <w:top w:val="single" w:sz="6" w:space="0" w:color="000000"/>
+              <w:left w:val="single" w:sz="6" w:space="0" w:color="000000"/>
+              <w:bottom w:val="single" w:sz="6" w:space="0" w:color="000000"/>
+              <w:right w:val="single" w:sz="6" w:space="0" w:color="000000"/>
+            </w:tcBorders>
+            <w:vAlign w:val="center"/>
+          </w:tcPr>
+          <w:p>
+            <w:r>
+              <w:t>{%tr endfor %}</w:t>
+            </w:r>
+          </w:p>
+        </w:tc>
+        <w:tc>
+          <w:tcPr>
+            <w:tcW w:w="1574" w:type="dxa"/>
+            <w:tcBorders>
+              <w:top w:val="single" w:sz="6" w:space="0" w:color="000000"/>
+              <w:left w:val="single" w:sz="6" w:space="0" w:color="000000"/>
+              <w:bottom w:val="single" w:sz="6" w:space="0" w:color="000000"/>
+              <w:right w:val="single" w:sz="6" w:space="0" w:color="000000"/>
+            </w:tcBorders>
+          </w:tcPr>
+          <w:p>
+            <w:r/>
+          </w:p>
+        </w:tc>
+        <w:tc>
+          <w:tcPr>
+            <w:tcW w:w="1472" w:type="dxa"/>
+            <w:tcBorders>
+              <w:top w:val="single" w:sz="6" w:space="0" w:color="000000"/>
+              <w:left w:val="single" w:sz="6" w:space="0" w:color="000000"/>
+              <w:bottom w:val="single" w:sz="6" w:space="0" w:color="000000"/>
+              <w:right w:val="single" w:sz="6" w:space="0" w:color="000000"/>
+            </w:tcBorders>
+          </w:tcPr>
+          <w:p>
+            <w:r/>
+          </w:p>
+        </w:tc>
+        <w:tc>
+          <w:tcPr>
+            <w:tcW w:w="3405" w:type="dxa"/>
+            <w:tcBorders>
+              <w:top w:val="single" w:sz="6" w:space="0" w:color="000000"/>
+              <w:left w:val="single" w:sz="6" w:space="0" w:color="000000"/>
+              <w:bottom w:val="single" w:sz="6" w:space="0" w:color="000000"/>
+              <w:right w:val="single" w:sz="6" w:space="0" w:color="000000"/>
+            </w:tcBorders>
+          </w:tcPr>
+          <w:p>
+            <w:r/>
+          </w:p>
+        </w:tc>
+        <w:tc>
+          <w:tcPr>
+            <w:tcW w:w="3405" w:type="dxa"/>
+            <w:tcBorders>
+              <w:top w:val="single" w:sz="6" w:space="0" w:color="000000"/>
+              <w:left w:val="single" w:sz="6" w:space="0" w:color="000000"/>
+              <w:bottom w:val="single" w:sz="6" w:space="0" w:color="000000"/>
+              <w:right w:val="single" w:sz="6" w:space="0" w:color="000000"/>
+            </w:tcBorders>
+          </w:tcPr>
+          <w:p>
+            <w:r/>
           </w:p>
         </w:tc>
       </w:tr>
@@ -2400,7 +2469,7 @@
           </mc:Choice>
           <mc:Fallback>
             <w:pict>
-              <v:shape w14:anchorId="5C5DB690" id="Graphic 7" o:spid="_x0000_s1026" style="position:absolute;margin-left:80.65pt;margin-top:22.75pt;width:80.65pt;height:.1pt;z-index:-15727616;visibility:visible;mso-wrap-style:square;mso-wrap-distance-left:0;mso-wrap-distance-top:0;mso-wrap-distance-right:0;mso-wrap-distance-bottom:0;mso-position-horizontal:absolute;mso-position-horizontal-relative:page;mso-position-vertical:absolute;mso-position-vertical-relative:text;v-text-anchor:top" coordsize="1024255,1270" o:gfxdata="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" path="m,l1024128,e" filled="f" strokeweight=".22069mm">
+              <v:shape w14:anchorId="56EED62B" id="Graphic 7" o:spid="_x0000_s1026" style="position:absolute;margin-left:80.65pt;margin-top:22.75pt;width:80.65pt;height:.1pt;z-index:-15727616;visibility:visible;mso-wrap-style:square;mso-wrap-distance-left:0;mso-wrap-distance-top:0;mso-wrap-distance-right:0;mso-wrap-distance-bottom:0;mso-position-horizontal:absolute;mso-position-horizontal-relative:page;mso-position-vertical:absolute;mso-position-vertical-relative:text;v-text-anchor:top" coordsize="1024255,1270" o:gfxdata="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" path="m,l1024128,e" filled="f" strokeweight=".22069mm">
                 <v:path arrowok="t"/>
                 <w10:wrap type="topAndBottom" anchorx="page"/>
               </v:shape>
@@ -2480,7 +2549,7 @@
           </mc:Choice>
           <mc:Fallback>
             <w:pict>
-              <v:shape w14:anchorId="6F38C176" id="Graphic 8" o:spid="_x0000_s1026" style="position:absolute;margin-left:256.95pt;margin-top:22.75pt;width:80.65pt;height:.1pt;z-index:-15727104;visibility:visible;mso-wrap-style:square;mso-wrap-distance-left:0;mso-wrap-distance-top:0;mso-wrap-distance-right:0;mso-wrap-distance-bottom:0;mso-position-horizontal:absolute;mso-position-horizontal-relative:page;mso-position-vertical:absolute;mso-position-vertical-relative:text;v-text-anchor:top" coordsize="1024255,1270" o:gfxdata="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" path="m,l1024128,e" filled="f" strokeweight=".22069mm">
+              <v:shape w14:anchorId="684F092E" id="Graphic 8" o:spid="_x0000_s1026" style="position:absolute;margin-left:256.95pt;margin-top:22.75pt;width:80.65pt;height:.1pt;z-index:-15727104;visibility:visible;mso-wrap-style:square;mso-wrap-distance-left:0;mso-wrap-distance-top:0;mso-wrap-distance-right:0;mso-wrap-distance-bottom:0;mso-position-horizontal:absolute;mso-position-horizontal-relative:page;mso-position-vertical:absolute;mso-position-vertical-relative:text;v-text-anchor:top" coordsize="1024255,1270" o:gfxdata="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" path="m,l1024128,e" filled="f" strokeweight=".22069mm">
                 <v:path arrowok="t"/>
                 <w10:wrap type="topAndBottom" anchorx="page"/>
               </v:shape>
@@ -2560,7 +2629,7 @@
           </mc:Choice>
           <mc:Fallback>
             <w:pict>
-              <v:shape w14:anchorId="6C2356FA" id="Graphic 9" o:spid="_x0000_s1026" style="position:absolute;margin-left:433.6pt;margin-top:22.75pt;width:80.65pt;height:.1pt;z-index:-15726592;visibility:visible;mso-wrap-style:square;mso-wrap-distance-left:0;mso-wrap-distance-top:0;mso-wrap-distance-right:0;mso-wrap-distance-bottom:0;mso-position-horizontal:absolute;mso-position-horizontal-relative:page;mso-position-vertical:absolute;mso-position-vertical-relative:text;v-text-anchor:top" coordsize="1024255,1270" o:gfxdata="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" path="m,l1024128,e" filled="f" strokeweight=".22069mm">
+              <v:shape w14:anchorId="33CE7A86" id="Graphic 9" o:spid="_x0000_s1026" style="position:absolute;margin-left:433.6pt;margin-top:22.75pt;width:80.65pt;height:.1pt;z-index:-15726592;visibility:visible;mso-wrap-style:square;mso-wrap-distance-left:0;mso-wrap-distance-top:0;mso-wrap-distance-right:0;mso-wrap-distance-bottom:0;mso-position-horizontal:absolute;mso-position-horizontal-relative:page;mso-position-vertical:absolute;mso-position-vertical-relative:text;v-text-anchor:top" coordsize="1024255,1270" o:gfxdata="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" path="m,l1024128,e" filled="f" strokeweight=".22069mm">
                 <v:path arrowok="t"/>
                 <w10:wrap type="topAndBottom" anchorx="page"/>
               </v:shape>

</xml_diff>

<commit_message>
feat: implement tenant credentials management with JSON file support
</commit_message>
<xml_diff>
--- a/fast-api-middleware/app/features/e_rapor/templates/rapor_template.docx
+++ b/fast-api-middleware/app/features/e_rapor/templates/rapor_template.docx
@@ -164,7 +164,7 @@
           </mc:Choice>
           <mc:Fallback>
             <w:pict>
-              <v:group w14:anchorId="2FE3C736" id="Group 1" o:spid="_x0000_s1026" style="width:530.6pt;height:67.2pt;mso-position-horizontal-relative:char;mso-position-vertical-relative:line" coordsize="67386,8536" o:gfxdata="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">
+              <v:group w14:anchorId="0E73FEDB" id="Group 1" o:spid="_x0000_s1026" style="width:530.6pt;height:67.2pt;mso-position-horizontal-relative:char;mso-position-vertical-relative:line" coordsize="67386,8536" o:gfxdata="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">
                 <v:shape id="Graphic 2" o:spid="_x0000_s1027" style="position:absolute;top:8371;width:67386;height:165;visibility:visible;mso-wrap-style:square;v-text-anchor:top" coordsize="6738620,16510" o:gfxdata="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" path="m6738111,16255l,16255,,,6738111,r,16255xe" fillcolor="black" stroked="f">
                   <v:path arrowok="t"/>
                 </v:shape>
@@ -1495,6 +1495,9 @@
             <w:r>
               <w:t>{%tr for sub in subjects %}</w:t>
             </w:r>
+            <w:r>
+              <w:t>{{ sub.no }}</w:t>
+            </w:r>
           </w:p>
         </w:tc>
         <w:tc>
@@ -1502,7 +1505,9 @@
             <w:tcW w:w="1574" w:type="dxa"/>
           </w:tcPr>
           <w:p>
-            <w:r/>
+            <w:r>
+              <w:t>{{ sub.subject_name }}</w:t>
+            </w:r>
           </w:p>
         </w:tc>
         <w:tc>
@@ -1510,7 +1515,9 @@
             <w:tcW w:w="1472" w:type="dxa"/>
           </w:tcPr>
           <w:p>
-            <w:r/>
+            <w:r>
+              <w:t>{{ sub.nilai_akhir }}</w:t>
+            </w:r>
           </w:p>
         </w:tc>
         <w:tc>
@@ -1518,7 +1525,9 @@
             <w:tcW w:w="3405" w:type="dxa"/>
           </w:tcPr>
           <w:p>
-            <w:r/>
+            <w:r>
+              <w:t>{{ sub.predikat }}</w:t>
+            </w:r>
           </w:p>
         </w:tc>
         <w:tc>
@@ -1526,111 +1535,15 @@
             <w:tcW w:w="3405" w:type="dxa"/>
           </w:tcPr>
           <w:p>
-            <w:r/>
-          </w:p>
-        </w:tc>
-      </w:tr>
-      <w:tr>
-        <w:trPr>
-          <w:trHeight w:val="637"/>
-        </w:trPr>
-        <w:tc>
-          <w:tcPr>
-            <w:tcW w:w="742" w:type="dxa"/>
-            <w:vAlign w:val="center"/>
-          </w:tcPr>
-          <w:p>
-            <w:r>
-              <w:t>{{ sub.no }}</w:t>
-            </w:r>
-          </w:p>
-        </w:tc>
-        <w:tc>
-          <w:tcPr>
-            <w:tcW w:w="1574" w:type="dxa"/>
-          </w:tcPr>
-          <w:p>
-            <w:r>
-              <w:t>{{ sub.subject_name }}</w:t>
-            </w:r>
-          </w:p>
-        </w:tc>
-        <w:tc>
-          <w:tcPr>
-            <w:tcW w:w="1472" w:type="dxa"/>
-          </w:tcPr>
-          <w:p>
-            <w:r>
-              <w:t>{{ sub.nilai_akhir }}</w:t>
-            </w:r>
-          </w:p>
-        </w:tc>
-        <w:tc>
-          <w:tcPr>
-            <w:tcW w:w="3405" w:type="dxa"/>
-          </w:tcPr>
-          <w:p>
-            <w:r>
-              <w:t>{{ sub.predikat }}</w:t>
-            </w:r>
-          </w:p>
-        </w:tc>
-        <w:tc>
-          <w:tcPr>
-            <w:tcW w:w="3405" w:type="dxa"/>
-          </w:tcPr>
-          <w:p>
             <w:r>
               <w:t>{{ sub.catatan }}</w:t>
             </w:r>
-          </w:p>
-        </w:tc>
-      </w:tr>
-      <w:tr>
-        <w:trPr>
-          <w:trHeight w:val="637"/>
-        </w:trPr>
-        <w:tc>
-          <w:tcPr>
-            <w:tcW w:w="742" w:type="dxa"/>
-            <w:vAlign w:val="center"/>
-          </w:tcPr>
-          <w:p>
+            <w:r>
+              <w:t xml:space="preserve"> </w:t>
+            </w:r>
             <w:r>
               <w:t>{%tr endfor %}</w:t>
             </w:r>
-          </w:p>
-        </w:tc>
-        <w:tc>
-          <w:tcPr>
-            <w:tcW w:w="1574" w:type="dxa"/>
-          </w:tcPr>
-          <w:p>
-            <w:r/>
-          </w:p>
-        </w:tc>
-        <w:tc>
-          <w:tcPr>
-            <w:tcW w:w="1472" w:type="dxa"/>
-          </w:tcPr>
-          <w:p>
-            <w:r/>
-          </w:p>
-        </w:tc>
-        <w:tc>
-          <w:tcPr>
-            <w:tcW w:w="3405" w:type="dxa"/>
-          </w:tcPr>
-          <w:p>
-            <w:r/>
-          </w:p>
-        </w:tc>
-        <w:tc>
-          <w:tcPr>
-            <w:tcW w:w="3405" w:type="dxa"/>
-          </w:tcPr>
-          <w:p>
-            <w:r/>
           </w:p>
         </w:tc>
       </w:tr>
@@ -1912,6 +1825,9 @@
             <w:r>
               <w:t>{%tr for m in muatan_lokal %}</w:t>
             </w:r>
+            <w:r>
+              <w:t>{{ m.no }}</w:t>
+            </w:r>
           </w:p>
         </w:tc>
         <w:tc>
@@ -1925,7 +1841,9 @@
             </w:tcBorders>
           </w:tcPr>
           <w:p>
-            <w:r/>
+            <w:r>
+              <w:t>{{ m.subject_name }}</w:t>
+            </w:r>
           </w:p>
         </w:tc>
         <w:tc>
@@ -1939,7 +1857,9 @@
             </w:tcBorders>
           </w:tcPr>
           <w:p>
-            <w:r/>
+            <w:r>
+              <w:t>{{ m.nilai_akhir }}</w:t>
+            </w:r>
           </w:p>
         </w:tc>
         <w:tc>
@@ -1953,7 +1873,9 @@
             </w:tcBorders>
           </w:tcPr>
           <w:p>
-            <w:r/>
+            <w:r>
+              <w:t>{{ m.predikat }}</w:t>
+            </w:r>
           </w:p>
         </w:tc>
         <w:tc>
@@ -1967,171 +1889,15 @@
             </w:tcBorders>
           </w:tcPr>
           <w:p>
-            <w:r/>
-          </w:p>
-        </w:tc>
-      </w:tr>
-      <w:tr>
-        <w:trPr>
-          <w:trHeight w:val="637"/>
-        </w:trPr>
-        <w:tc>
-          <w:tcPr>
-            <w:tcW w:w="742" w:type="dxa"/>
-            <w:tcBorders>
-              <w:top w:val="single" w:sz="6" w:space="0" w:color="000000"/>
-              <w:left w:val="single" w:sz="6" w:space="0" w:color="000000"/>
-              <w:bottom w:val="single" w:sz="6" w:space="0" w:color="000000"/>
-              <w:right w:val="single" w:sz="6" w:space="0" w:color="000000"/>
-            </w:tcBorders>
-            <w:vAlign w:val="center"/>
-          </w:tcPr>
-          <w:p>
-            <w:r>
-              <w:t>{{ m.no }}</w:t>
-            </w:r>
-          </w:p>
-        </w:tc>
-        <w:tc>
-          <w:tcPr>
-            <w:tcW w:w="1574" w:type="dxa"/>
-            <w:tcBorders>
-              <w:top w:val="single" w:sz="6" w:space="0" w:color="000000"/>
-              <w:left w:val="single" w:sz="6" w:space="0" w:color="000000"/>
-              <w:bottom w:val="single" w:sz="6" w:space="0" w:color="000000"/>
-              <w:right w:val="single" w:sz="6" w:space="0" w:color="000000"/>
-            </w:tcBorders>
-          </w:tcPr>
-          <w:p>
-            <w:r>
-              <w:t>{{ m.subject_name }}</w:t>
-            </w:r>
-          </w:p>
-        </w:tc>
-        <w:tc>
-          <w:tcPr>
-            <w:tcW w:w="1472" w:type="dxa"/>
-            <w:tcBorders>
-              <w:top w:val="single" w:sz="6" w:space="0" w:color="000000"/>
-              <w:left w:val="single" w:sz="6" w:space="0" w:color="000000"/>
-              <w:bottom w:val="single" w:sz="6" w:space="0" w:color="000000"/>
-              <w:right w:val="single" w:sz="6" w:space="0" w:color="000000"/>
-            </w:tcBorders>
-          </w:tcPr>
-          <w:p>
-            <w:r>
-              <w:t>{{ m.nilai_akhir }}</w:t>
-            </w:r>
-          </w:p>
-        </w:tc>
-        <w:tc>
-          <w:tcPr>
-            <w:tcW w:w="3405" w:type="dxa"/>
-            <w:tcBorders>
-              <w:top w:val="single" w:sz="6" w:space="0" w:color="000000"/>
-              <w:left w:val="single" w:sz="6" w:space="0" w:color="000000"/>
-              <w:bottom w:val="single" w:sz="6" w:space="0" w:color="000000"/>
-              <w:right w:val="single" w:sz="6" w:space="0" w:color="000000"/>
-            </w:tcBorders>
-          </w:tcPr>
-          <w:p>
-            <w:r>
-              <w:t>{{ m.predikat }}</w:t>
-            </w:r>
-          </w:p>
-        </w:tc>
-        <w:tc>
-          <w:tcPr>
-            <w:tcW w:w="3405" w:type="dxa"/>
-            <w:tcBorders>
-              <w:top w:val="single" w:sz="6" w:space="0" w:color="000000"/>
-              <w:left w:val="single" w:sz="6" w:space="0" w:color="000000"/>
-              <w:bottom w:val="single" w:sz="6" w:space="0" w:color="000000"/>
-              <w:right w:val="single" w:sz="6" w:space="0" w:color="000000"/>
-            </w:tcBorders>
-          </w:tcPr>
-          <w:p>
             <w:r>
               <w:t>{{ m.catatan }}</w:t>
             </w:r>
-          </w:p>
-        </w:tc>
-      </w:tr>
-      <w:tr>
-        <w:trPr>
-          <w:trHeight w:val="637"/>
-        </w:trPr>
-        <w:tc>
-          <w:tcPr>
-            <w:tcW w:w="742" w:type="dxa"/>
-            <w:tcBorders>
-              <w:top w:val="single" w:sz="6" w:space="0" w:color="000000"/>
-              <w:left w:val="single" w:sz="6" w:space="0" w:color="000000"/>
-              <w:bottom w:val="single" w:sz="6" w:space="0" w:color="000000"/>
-              <w:right w:val="single" w:sz="6" w:space="0" w:color="000000"/>
-            </w:tcBorders>
-            <w:vAlign w:val="center"/>
-          </w:tcPr>
-          <w:p>
+            <w:r>
+              <w:t xml:space="preserve"> </w:t>
+            </w:r>
             <w:r>
               <w:t>{%tr endfor %}</w:t>
             </w:r>
-          </w:p>
-        </w:tc>
-        <w:tc>
-          <w:tcPr>
-            <w:tcW w:w="1574" w:type="dxa"/>
-            <w:tcBorders>
-              <w:top w:val="single" w:sz="6" w:space="0" w:color="000000"/>
-              <w:left w:val="single" w:sz="6" w:space="0" w:color="000000"/>
-              <w:bottom w:val="single" w:sz="6" w:space="0" w:color="000000"/>
-              <w:right w:val="single" w:sz="6" w:space="0" w:color="000000"/>
-            </w:tcBorders>
-          </w:tcPr>
-          <w:p>
-            <w:r/>
-          </w:p>
-        </w:tc>
-        <w:tc>
-          <w:tcPr>
-            <w:tcW w:w="1472" w:type="dxa"/>
-            <w:tcBorders>
-              <w:top w:val="single" w:sz="6" w:space="0" w:color="000000"/>
-              <w:left w:val="single" w:sz="6" w:space="0" w:color="000000"/>
-              <w:bottom w:val="single" w:sz="6" w:space="0" w:color="000000"/>
-              <w:right w:val="single" w:sz="6" w:space="0" w:color="000000"/>
-            </w:tcBorders>
-          </w:tcPr>
-          <w:p>
-            <w:r/>
-          </w:p>
-        </w:tc>
-        <w:tc>
-          <w:tcPr>
-            <w:tcW w:w="3405" w:type="dxa"/>
-            <w:tcBorders>
-              <w:top w:val="single" w:sz="6" w:space="0" w:color="000000"/>
-              <w:left w:val="single" w:sz="6" w:space="0" w:color="000000"/>
-              <w:bottom w:val="single" w:sz="6" w:space="0" w:color="000000"/>
-              <w:right w:val="single" w:sz="6" w:space="0" w:color="000000"/>
-            </w:tcBorders>
-          </w:tcPr>
-          <w:p>
-            <w:r/>
-          </w:p>
-        </w:tc>
-        <w:tc>
-          <w:tcPr>
-            <w:tcW w:w="3405" w:type="dxa"/>
-            <w:tcBorders>
-              <w:top w:val="single" w:sz="6" w:space="0" w:color="000000"/>
-              <w:left w:val="single" w:sz="6" w:space="0" w:color="000000"/>
-              <w:bottom w:val="single" w:sz="6" w:space="0" w:color="000000"/>
-              <w:right w:val="single" w:sz="6" w:space="0" w:color="000000"/>
-            </w:tcBorders>
-          </w:tcPr>
-          <w:p>
-            <w:r/>
           </w:p>
         </w:tc>
       </w:tr>
@@ -2469,7 +2235,7 @@
           </mc:Choice>
           <mc:Fallback>
             <w:pict>
-              <v:shape w14:anchorId="56EED62B" id="Graphic 7" o:spid="_x0000_s1026" style="position:absolute;margin-left:80.65pt;margin-top:22.75pt;width:80.65pt;height:.1pt;z-index:-15727616;visibility:visible;mso-wrap-style:square;mso-wrap-distance-left:0;mso-wrap-distance-top:0;mso-wrap-distance-right:0;mso-wrap-distance-bottom:0;mso-position-horizontal:absolute;mso-position-horizontal-relative:page;mso-position-vertical:absolute;mso-position-vertical-relative:text;v-text-anchor:top" coordsize="1024255,1270" o:gfxdata="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" path="m,l1024128,e" filled="f" strokeweight=".22069mm">
+              <v:shape w14:anchorId="2364FD3C" id="Graphic 7" o:spid="_x0000_s1026" style="position:absolute;margin-left:80.65pt;margin-top:22.75pt;width:80.65pt;height:.1pt;z-index:-15727616;visibility:visible;mso-wrap-style:square;mso-wrap-distance-left:0;mso-wrap-distance-top:0;mso-wrap-distance-right:0;mso-wrap-distance-bottom:0;mso-position-horizontal:absolute;mso-position-horizontal-relative:page;mso-position-vertical:absolute;mso-position-vertical-relative:text;v-text-anchor:top" coordsize="1024255,1270" o:gfxdata="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" path="m,l1024128,e" filled="f" strokeweight=".22069mm">
                 <v:path arrowok="t"/>
                 <w10:wrap type="topAndBottom" anchorx="page"/>
               </v:shape>
@@ -2549,7 +2315,7 @@
           </mc:Choice>
           <mc:Fallback>
             <w:pict>
-              <v:shape w14:anchorId="684F092E" id="Graphic 8" o:spid="_x0000_s1026" style="position:absolute;margin-left:256.95pt;margin-top:22.75pt;width:80.65pt;height:.1pt;z-index:-15727104;visibility:visible;mso-wrap-style:square;mso-wrap-distance-left:0;mso-wrap-distance-top:0;mso-wrap-distance-right:0;mso-wrap-distance-bottom:0;mso-position-horizontal:absolute;mso-position-horizontal-relative:page;mso-position-vertical:absolute;mso-position-vertical-relative:text;v-text-anchor:top" coordsize="1024255,1270" o:gfxdata="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" path="m,l1024128,e" filled="f" strokeweight=".22069mm">
+              <v:shape w14:anchorId="35B6D9B7" id="Graphic 8" o:spid="_x0000_s1026" style="position:absolute;margin-left:256.95pt;margin-top:22.75pt;width:80.65pt;height:.1pt;z-index:-15727104;visibility:visible;mso-wrap-style:square;mso-wrap-distance-left:0;mso-wrap-distance-top:0;mso-wrap-distance-right:0;mso-wrap-distance-bottom:0;mso-position-horizontal:absolute;mso-position-horizontal-relative:page;mso-position-vertical:absolute;mso-position-vertical-relative:text;v-text-anchor:top" coordsize="1024255,1270" o:gfxdata="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" path="m,l1024128,e" filled="f" strokeweight=".22069mm">
                 <v:path arrowok="t"/>
                 <w10:wrap type="topAndBottom" anchorx="page"/>
               </v:shape>
@@ -2629,7 +2395,7 @@
           </mc:Choice>
           <mc:Fallback>
             <w:pict>
-              <v:shape w14:anchorId="33CE7A86" id="Graphic 9" o:spid="_x0000_s1026" style="position:absolute;margin-left:433.6pt;margin-top:22.75pt;width:80.65pt;height:.1pt;z-index:-15726592;visibility:visible;mso-wrap-style:square;mso-wrap-distance-left:0;mso-wrap-distance-top:0;mso-wrap-distance-right:0;mso-wrap-distance-bottom:0;mso-position-horizontal:absolute;mso-position-horizontal-relative:page;mso-position-vertical:absolute;mso-position-vertical-relative:text;v-text-anchor:top" coordsize="1024255,1270" o:gfxdata="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" path="m,l1024128,e" filled="f" strokeweight=".22069mm">
+              <v:shape w14:anchorId="3DB59387" id="Graphic 9" o:spid="_x0000_s1026" style="position:absolute;margin-left:433.6pt;margin-top:22.75pt;width:80.65pt;height:.1pt;z-index:-15726592;visibility:visible;mso-wrap-style:square;mso-wrap-distance-left:0;mso-wrap-distance-top:0;mso-wrap-distance-right:0;mso-wrap-distance-bottom:0;mso-position-horizontal:absolute;mso-position-horizontal-relative:page;mso-position-vertical:absolute;mso-position-vertical-relative:text;v-text-anchor:top" coordsize="1024255,1270" o:gfxdata="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" path="m,l1024128,e" filled="f" strokeweight=".22069mm">
                 <v:path arrowok="t"/>
                 <w10:wrap type="topAndBottom" anchorx="page"/>
               </v:shape>

</xml_diff>